<commit_message>
docs: agregar codigo sin formato y enlace al repositorio
</commit_message>
<xml_diff>
--- a/Evidencia_Unidad_IV.docx
+++ b/Evidencia_Unidad_IV.docx
@@ -26,12 +26,7 @@
     </w:p>
     <w:p>
       <w:r>
-        <w:t>Repositorio Git: [PEGAR AQUÍ EL ENLACE DEL REPOSITORIO PUBLICADO]</w:t>
-      </w:r>
-    </w:p>
-    <w:p>
-      <w:r>
-        <w:t>Ejecución de los 13 ejercicios en Python. Las capturas muestran los resultados de cada programa y las validaciones solicitadas.</w:t>
+        <w:t>Repositorio Git: https://github.com/Havii001971/tarea-unidad4-poo-python</w:t>
       </w:r>
     </w:p>
     <w:p>
@@ -1014,8 +1009,11 @@
     </w:pPr>
     <w:rPr>
       <w:rFonts w:ascii="Calibri" w:hAnsi="Calibri"/>
+      <w:b w:val="0"/>
+      <w:i w:val="0"/>
       <w:color w:val="000000"/>
       <w:sz w:val="22"/>
+      <w:u w:val="none"/>
     </w:rPr>
   </w:style>
   <w:style w:type="paragraph" w:styleId="Header">
@@ -1078,11 +1076,13 @@
     </w:pPr>
     <w:rPr>
       <w:rFonts w:asciiTheme="majorHAnsi" w:eastAsiaTheme="majorEastAsia" w:hAnsiTheme="majorHAnsi" w:cstheme="majorBidi" w:ascii="Calibri" w:hAnsi="Calibri"/>
-      <w:b/>
+      <w:b w:val="0"/>
       <w:bCs/>
+      <w:i w:val="0"/>
       <w:color w:val="000000"/>
-      <w:sz w:val="28"/>
+      <w:sz w:val="22"/>
       <w:szCs w:val="28"/>
+      <w:u w:val="none"/>
     </w:rPr>
   </w:style>
   <w:style w:type="paragraph" w:styleId="Heading2">
@@ -1364,11 +1364,14 @@
     </w:pPr>
     <w:rPr>
       <w:rFonts w:asciiTheme="majorHAnsi" w:eastAsiaTheme="majorEastAsia" w:hAnsiTheme="majorHAnsi" w:cstheme="majorBidi" w:ascii="Calibri" w:hAnsi="Calibri"/>
+      <w:b w:val="0"/>
+      <w:i w:val="0"/>
       <w:color w:val="000000"/>
       <w:spacing w:val="5"/>
       <w:kern w:val="28"/>
-      <w:sz w:val="44"/>
+      <w:sz w:val="22"/>
       <w:szCs w:val="52"/>
+      <w:u w:val="none"/>
     </w:rPr>
   </w:style>
   <w:style w:type="character" w:customStyle="1" w:styleId="TitleChar">

</xml_diff>